<commit_message>
Adding ability to append/remove sections from report, closes #33. Added full AI provenance, including to report, closes #59
</commit_message>
<xml_diff>
--- a/public/data/template.docx
+++ b/public/data/template.docx
@@ -1528,6 +1528,11 @@
       </w:r>
     </w:p>
     <w:p>
+      <w:r>
+        <w:t>{{aiAssistedNotice}}</w:t>
+      </w:r>
+    </w:p>
+    <w:p>
       <w:pPr>
         <w:pStyle w:val="Heading2"/>
       </w:pPr>
@@ -2217,7 +2222,16 @@
         </w:r>
       </w:hyperlink>
     </w:p>
-    <w:p/>
+    <w:p>
+      <w:r>
+        <w:t>{{aiProvenance}}</w:t>
+      </w:r>
+    </w:p>
+    <w:p>
+      <w:r>
+        <w:t>{{glossaryAppendix}}</w:t>
+      </w:r>
+    </w:p>
     <w:sectPr>
       <w:footerReference w:type="default" r:id="rId15"/>
       <w:pgSz w:w="11906" w:h="16838"/>

</xml_diff>

<commit_message>
Adding ability to have per organisation reports, closes #68
</commit_message>
<xml_diff>
--- a/public/data/template.docx
+++ b/public/data/template.docx
@@ -1762,7 +1762,6 @@
             <w:tcBorders>
               <w:bottom w:val="single" w:sz="4" w:space="0" w:color="000000"/>
             </w:tcBorders>
-            <w:shd w:val="clear" w:color="auto" w:fill="auto"/>
             <w:tcMar>
               <w:top w:w="100" w:type="dxa"/>
               <w:left w:w="100" w:type="dxa"/>
@@ -1813,7 +1812,6 @@
             <w:tcBorders>
               <w:bottom w:val="single" w:sz="4" w:space="0" w:color="000000"/>
             </w:tcBorders>
-            <w:shd w:val="clear" w:color="auto" w:fill="auto"/>
             <w:tcMar>
               <w:top w:w="100" w:type="dxa"/>
               <w:left w:w="100" w:type="dxa"/>
@@ -2053,10 +2051,49 @@
       </w:pPr>
     </w:p>
     <w:p>
+      <w:bookmarkStart w:id="17" w:name="_Toc200375933"/>
+      <w:r>
+        <w:t>{{</w:t>
+      </w:r>
+      <w:proofErr w:type="spellStart"/>
+      <w:r>
+        <w:t>aiProvenance</w:t>
+      </w:r>
+      <w:proofErr w:type="spellEnd"/>
+      <w:r>
+        <w:t>}}</w:t>
+      </w:r>
+    </w:p>
+    <w:p>
+      <w:r>
+        <w:t>{{</w:t>
+      </w:r>
+      <w:proofErr w:type="spellStart"/>
+      <w:r>
+        <w:t>glossaryAppendix</w:t>
+      </w:r>
+      <w:proofErr w:type="spellEnd"/>
+      <w:r>
+        <w:t>}}</w:t>
+      </w:r>
+    </w:p>
+    <w:p>
+      <w:pPr>
+        <w:rPr>
+          <w:b/>
+          <w:color w:val="072589"/>
+          <w:sz w:val="44"/>
+          <w:szCs w:val="44"/>
+        </w:rPr>
+      </w:pPr>
+      <w:r>
+        <w:br w:type="page"/>
+      </w:r>
+    </w:p>
+    <w:p>
       <w:pPr>
         <w:pStyle w:val="Heading2"/>
       </w:pPr>
-      <w:bookmarkStart w:id="17" w:name="_Toc200375933"/>
       <w:r>
         <w:t>Additional resources and support</w:t>
       </w:r>
@@ -2221,16 +2258,6 @@
           <w:t>View all our courses</w:t>
         </w:r>
       </w:hyperlink>
-    </w:p>
-    <w:p>
-      <w:r>
-        <w:t>{{aiProvenance}}</w:t>
-      </w:r>
-    </w:p>
-    <w:p>
-      <w:r>
-        <w:t>{{glossaryAppendix}}</w:t>
-      </w:r>
     </w:p>
     <w:sectPr>
       <w:footerReference w:type="default" r:id="rId15"/>

</xml_diff>